<commit_message>
Refresh public project documentation and licensing
- rewrite root README to highlight Web UI, MinIO console, Docker profiles, REST API, CLI, persistent LLM state, and config files
- add dedicated docs for Web UI, MinIO, Docker, REST API, CAD Agent CLI, and train_llm_state
- move CAD Agent CLI README content into docs/cad-agent-cli-readme.md
- migrate Web UI quick-start content into the root README
- replace architecture.drawio with a current editable architecture diagram
- update operational runbook for current stack behavior and troubleshooting
- update technical documentation DOCX for current architecture and runtime behavior
- expand testing.md with the current test module inventory
- switch LICENSE.md to MIT
- add compatibility pointer docs for renamed documentation paths
</commit_message>
<xml_diff>
--- a/docs/FreeCAD-AI_Technical_Documentation.docx
+++ b/docs/FreeCAD-AI_Technical_Documentation.docx
@@ -4,173 +4,580 @@
   <w:body>
     <w:p>
       <w:pPr>
-        <w:pStyle w:val="Heading1"/>
+        <w:pStyle w:val="Title"/>
+        <w:jc w:val="center"/>
       </w:pPr>
       <w:r>
-        <w:t>FreeCAD-AI – Full Technical Documentation</w:t>
+        <w:rPr>
+          <w:color w:val="1F4E79"/>
+        </w:rPr>
+        <w:t>FreeCAD AI</w:t>
+        <w:br/>
+        <w:t>Technical Documentation</w:t>
       </w:r>
     </w:p>
     <w:p>
       <w:pPr>
-        <w:pStyle w:val="Heading2"/>
+        <w:jc w:val="center"/>
       </w:pPr>
       <w:r>
-        <w:t>API Endpoints</w:t>
+        <w:rPr>
+          <w:i/>
+          <w:sz w:val="22"/>
+        </w:rPr>
+        <w:t>Updated for the current repository state and runtime behavior</w:t>
+      </w:r>
+    </w:p>
+    <w:p>
+      <w:pPr>
+        <w:pStyle w:val="Heading1"/>
+      </w:pPr>
+      <w:r>
+        <w:t>1. Overview</w:t>
       </w:r>
     </w:p>
     <w:p>
       <w:r>
-        <w:br/>
-        <w:t>POST /v1/sessions</w:t>
-        <w:br/>
-        <w:t>Request:</w:t>
-        <w:br/>
-        <w:t>{</w:t>
-        <w:br/>
-        <w:t xml:space="preserve">  "title": "Example Session"</w:t>
-        <w:br/>
-        <w:t>}</w:t>
-        <w:br/>
-        <w:br/>
-        <w:t>Response:</w:t>
-        <w:br/>
-        <w:t>{</w:t>
-        <w:br/>
-        <w:t xml:space="preserve">  "session_id": "uuid",</w:t>
-        <w:br/>
-        <w:t xml:space="preserve">  "status": "active"</w:t>
-        <w:br/>
-        <w:t>}</w:t>
-        <w:br/>
-        <w:br/>
-        <w:t>POST /v1/sessions/{id}/messages</w:t>
-        <w:br/>
-        <w:t>Request:</w:t>
-        <w:br/>
-        <w:t>{</w:t>
-        <w:br/>
-        <w:t xml:space="preserve">  "content": "Create a 10x20x5 box",</w:t>
-        <w:br/>
-        <w:t xml:space="preserve">  "mode": "design"</w:t>
-        <w:br/>
-        <w:t>}</w:t>
-        <w:br/>
-        <w:br/>
-        <w:t>Response:</w:t>
-        <w:br/>
-        <w:t>{</w:t>
-        <w:br/>
-        <w:t xml:space="preserve">  "job_id": "uuid"</w:t>
-        <w:br/>
-        <w:t>}</w:t>
-        <w:br/>
-        <w:br/>
-        <w:t>GET /v1/jobs/{job_id}</w:t>
-        <w:br/>
-        <w:t>Response:</w:t>
-        <w:br/>
-        <w:t>{</w:t>
-        <w:br/>
-        <w:t xml:space="preserve">  "status": "finished",</w:t>
-        <w:br/>
-        <w:t xml:space="preserve">  "artifacts": ["model.fcstd", "model.step"]</w:t>
-        <w:br/>
-        <w:t>}</w:t>
-        <w:br/>
+        <w:t>FreeCAD AI is a Docker-based application that accepts natural-language CAD requests, tracks them as jobs inside a session-oriented workflow, executes generated FreeCAD macros through a worker, stores artifacts in MinIO, and exposes the stack through both a browser UI and a REST API.</w:t>
       </w:r>
     </w:p>
     <w:p>
       <w:pPr>
-        <w:pStyle w:val="Heading2"/>
+        <w:pStyle w:val="Heading1"/>
       </w:pPr>
       <w:r>
-        <w:t>Failure Modes</w:t>
+        <w:t>2. Runtime Architecture</w:t>
+      </w:r>
+    </w:p>
+    <w:p>
+      <w:pPr>
+        <w:pStyle w:val="ListBullet"/>
+      </w:pPr>
+      <w:r>
+        <w:t>Web UI (`services/web-ui`) serves the browser application and reverse-proxies API calls.</w:t>
+      </w:r>
+    </w:p>
+    <w:p>
+      <w:pPr>
+        <w:pStyle w:val="ListBullet"/>
+      </w:pPr>
+      <w:r>
+        <w:t>API (`services/api`) manages sessions, jobs, logs, artifacts, and RAG-related routes.</w:t>
+      </w:r>
+    </w:p>
+    <w:p>
+      <w:pPr>
+        <w:pStyle w:val="ListBullet"/>
+      </w:pPr>
+      <w:r>
+        <w:t>Worker (`services/freecad-worker`) handles LLM prompting, macro validation, FreeCAD execution, retries, and artifact upload.</w:t>
+      </w:r>
+    </w:p>
+    <w:p>
+      <w:pPr>
+        <w:pStyle w:val="ListBullet"/>
+      </w:pPr>
+      <w:r>
+        <w:t>Redis provides queue coordination.</w:t>
+      </w:r>
+    </w:p>
+    <w:p>
+      <w:pPr>
+        <w:pStyle w:val="ListBullet"/>
+      </w:pPr>
+      <w:r>
+        <w:t>Postgres + pgvector stores application metadata, logs, metrics, and RAG source records.</w:t>
+      </w:r>
+    </w:p>
+    <w:p>
+      <w:pPr>
+        <w:pStyle w:val="ListBullet"/>
+      </w:pPr>
+      <w:r>
+        <w:t>MinIO stores generated artifacts and serves presigned downloads.</w:t>
+      </w:r>
+    </w:p>
+    <w:p>
+      <w:pPr>
+        <w:pStyle w:val="ListBullet"/>
+      </w:pPr>
+      <w:r>
+        <w:t>Persistent LLM state is mounted from the host and stored in `llm-state.sqlite3`.</w:t>
       </w:r>
     </w:p>
     <w:p>
       <w:r>
-        <w:br/>
-        <w:t>LLM Timeout:</w:t>
-        <w:br/>
-        <w:t>- Cause: model overload or long context</w:t>
-        <w:br/>
-        <w:t>- Effect: job marked failed</w:t>
-        <w:br/>
-        <w:t>- Mitigation: increase timeout or reduce ctx-size</w:t>
-        <w:br/>
-        <w:br/>
-        <w:t>Worker Crash:</w:t>
-        <w:br/>
-        <w:t>- Cause: FreeCAD segfault or memory</w:t>
-        <w:br/>
-        <w:t>- Effect: job stuck in started</w:t>
-        <w:br/>
-        <w:t>- Mitigation: worker restart + job requeue</w:t>
-        <w:br/>
-        <w:br/>
-        <w:t>Redis Eviction:</w:t>
-        <w:br/>
-        <w:t>- Cause: TTL expiry</w:t>
-        <w:br/>
-        <w:t>- Effect: job metadata lost</w:t>
-        <w:br/>
-        <w:t>- Mitigation: DB persistence</w:t>
-        <w:br/>
+        <w:t>The repository also includes a host-side CLI (`tools/cad_agent/cad_agent_cli.py`) and a training-state utility (`tools/train_llm_state.py`).</w:t>
       </w:r>
     </w:p>
     <w:p>
       <w:pPr>
-        <w:pStyle w:val="Heading2"/>
+        <w:pStyle w:val="Heading1"/>
       </w:pPr>
       <w:r>
-        <w:t>Operational Runbook</w:t>
+        <w:t>3. Browser and CLI Entry Points</w:t>
+      </w:r>
+    </w:p>
+    <w:tbl>
+      <w:tblPr>
+        <w:tblStyle w:val="TableGrid"/>
+        <w:tblW w:type="auto" w:w="0"/>
+        <w:tblLook w:firstColumn="1" w:firstRow="1" w:lastColumn="0" w:lastRow="0" w:noHBand="0" w:noVBand="1" w:val="04A0"/>
+      </w:tblPr>
+      <w:tblGrid>
+        <w:gridCol w:w="3312"/>
+        <w:gridCol w:w="3312"/>
+        <w:gridCol w:w="3312"/>
+      </w:tblGrid>
+      <w:tr>
+        <w:tc>
+          <w:tcPr>
+            <w:tcW w:type="dxa" w:w="3312"/>
+          </w:tcPr>
+          <w:p>
+            <w:r>
+              <w:t>Component</w:t>
+            </w:r>
+          </w:p>
+        </w:tc>
+        <w:tc>
+          <w:tcPr>
+            <w:tcW w:type="dxa" w:w="3312"/>
+          </w:tcPr>
+          <w:p>
+            <w:r>
+              <w:t>Default URL / Path</w:t>
+            </w:r>
+          </w:p>
+        </w:tc>
+        <w:tc>
+          <w:tcPr>
+            <w:tcW w:type="dxa" w:w="3312"/>
+          </w:tcPr>
+          <w:p>
+            <w:r>
+              <w:t>Purpose</w:t>
+            </w:r>
+          </w:p>
+        </w:tc>
+      </w:tr>
+      <w:tr>
+        <w:tc>
+          <w:tcPr>
+            <w:tcW w:type="dxa" w:w="3312"/>
+          </w:tcPr>
+          <w:p>
+            <w:r>
+              <w:t>Web UI</w:t>
+            </w:r>
+          </w:p>
+        </w:tc>
+        <w:tc>
+          <w:tcPr>
+            <w:tcW w:type="dxa" w:w="3312"/>
+          </w:tcPr>
+          <w:p>
+            <w:r>
+              <w:t>http://localhost:3000</w:t>
+            </w:r>
+          </w:p>
+        </w:tc>
+        <w:tc>
+          <w:tcPr>
+            <w:tcW w:type="dxa" w:w="3312"/>
+          </w:tcPr>
+          <w:p>
+            <w:r>
+              <w:t>Interactive session workflow, job tracking, logs, artifacts</w:t>
+            </w:r>
+          </w:p>
+        </w:tc>
+      </w:tr>
+      <w:tr>
+        <w:tc>
+          <w:tcPr>
+            <w:tcW w:type="dxa" w:w="3312"/>
+          </w:tcPr>
+          <w:p>
+            <w:r>
+              <w:t>Swagger UI</w:t>
+            </w:r>
+          </w:p>
+        </w:tc>
+        <w:tc>
+          <w:tcPr>
+            <w:tcW w:type="dxa" w:w="3312"/>
+          </w:tcPr>
+          <w:p>
+            <w:r>
+              <w:t>http://localhost:8080/docs</w:t>
+            </w:r>
+          </w:p>
+        </w:tc>
+        <w:tc>
+          <w:tcPr>
+            <w:tcW w:type="dxa" w:w="3312"/>
+          </w:tcPr>
+          <w:p>
+            <w:r>
+              <w:t>Interactive API exploration</w:t>
+            </w:r>
+          </w:p>
+        </w:tc>
+      </w:tr>
+      <w:tr>
+        <w:tc>
+          <w:tcPr>
+            <w:tcW w:type="dxa" w:w="3312"/>
+          </w:tcPr>
+          <w:p>
+            <w:r>
+              <w:t>OpenAPI JSON</w:t>
+            </w:r>
+          </w:p>
+        </w:tc>
+        <w:tc>
+          <w:tcPr>
+            <w:tcW w:type="dxa" w:w="3312"/>
+          </w:tcPr>
+          <w:p>
+            <w:r>
+              <w:t>http://localhost:8080/openapi.json</w:t>
+            </w:r>
+          </w:p>
+        </w:tc>
+        <w:tc>
+          <w:tcPr>
+            <w:tcW w:type="dxa" w:w="3312"/>
+          </w:tcPr>
+          <w:p>
+            <w:r>
+              <w:t>Schema export and client generation</w:t>
+            </w:r>
+          </w:p>
+        </w:tc>
+      </w:tr>
+      <w:tr>
+        <w:tc>
+          <w:tcPr>
+            <w:tcW w:type="dxa" w:w="3312"/>
+          </w:tcPr>
+          <w:p>
+            <w:r>
+              <w:t>MinIO Console</w:t>
+            </w:r>
+          </w:p>
+        </w:tc>
+        <w:tc>
+          <w:tcPr>
+            <w:tcW w:type="dxa" w:w="3312"/>
+          </w:tcPr>
+          <w:p>
+            <w:r>
+              <w:t>http://localhost:9001</w:t>
+            </w:r>
+          </w:p>
+        </w:tc>
+        <w:tc>
+          <w:tcPr>
+            <w:tcW w:type="dxa" w:w="3312"/>
+          </w:tcPr>
+          <w:p>
+            <w:r>
+              <w:t>Inspect stored artifacts in a browser</w:t>
+            </w:r>
+          </w:p>
+        </w:tc>
+      </w:tr>
+      <w:tr>
+        <w:tc>
+          <w:tcPr>
+            <w:tcW w:type="dxa" w:w="3312"/>
+          </w:tcPr>
+          <w:p>
+            <w:r>
+              <w:t>CAD Agent CLI</w:t>
+            </w:r>
+          </w:p>
+        </w:tc>
+        <w:tc>
+          <w:tcPr>
+            <w:tcW w:type="dxa" w:w="3312"/>
+          </w:tcPr>
+          <w:p>
+            <w:r>
+              <w:t>tools/cad_agent/cad_agent_cli.py</w:t>
+            </w:r>
+          </w:p>
+        </w:tc>
+        <w:tc>
+          <w:tcPr>
+            <w:tcW w:type="dxa" w:w="3312"/>
+          </w:tcPr>
+          <w:p>
+            <w:r>
+              <w:t>Shell-based automation and diagnostics</w:t>
+            </w:r>
+          </w:p>
+        </w:tc>
+      </w:tr>
+    </w:tbl>
+    <w:p>
+      <w:pPr>
+        <w:pStyle w:val="Heading1"/>
+      </w:pPr>
+      <w:r>
+        <w:t>4. Key API Surface</w:t>
       </w:r>
     </w:p>
     <w:p>
       <w:r>
-        <w:br/>
-        <w:t>If jobs stuck in started:</w:t>
-        <w:br/>
-        <w:t>1. Check worker logs</w:t>
-        <w:br/>
-        <w:t>2. Verify Redis connectivity</w:t>
-        <w:br/>
-        <w:t>3. Confirm LLM /health endpoint</w:t>
-        <w:br/>
-        <w:br/>
-        <w:t>If API returns 500:</w:t>
-        <w:br/>
-        <w:t>1. Inspect FastAPI logs</w:t>
-        <w:br/>
-        <w:t>2. Check DB migrations</w:t>
-        <w:br/>
-        <w:t>3. Validate environment variables</w:t>
-        <w:br/>
-        <w:br/>
-        <w:t>Profile switching:</w:t>
-        <w:br/>
-        <w:t>docker compose --profile test up -d</w:t>
-        <w:br/>
-        <w:t>docker compose --profile cpu up -d</w:t>
-        <w:br/>
+        <w:t>The current API route groups are:</w:t>
       </w:r>
     </w:p>
     <w:p>
       <w:pPr>
-        <w:pStyle w:val="Heading2"/>
+        <w:pStyle w:val="ListBullet"/>
       </w:pPr>
       <w:r>
-        <w:t>Architecture Diagram</w:t>
+        <w:t>Health: `/health`, `/health/llm`</w:t>
+      </w:r>
+    </w:p>
+    <w:p>
+      <w:pPr>
+        <w:pStyle w:val="ListBullet"/>
+      </w:pPr>
+      <w:r>
+        <w:t>Sessions: create, fork, close, send messages, read logs, read metrics, list artifacts</w:t>
+      </w:r>
+    </w:p>
+    <w:p>
+      <w:pPr>
+        <w:pStyle w:val="ListBullet"/>
+      </w:pPr>
+      <w:r>
+        <w:t>Jobs: `GET /v1/jobs/{job_id}`</w:t>
+      </w:r>
+    </w:p>
+    <w:p>
+      <w:pPr>
+        <w:pStyle w:val="ListBullet"/>
+      </w:pPr>
+      <w:r>
+        <w:t>Artifacts: artifact metadata and content routes</w:t>
+      </w:r>
+    </w:p>
+    <w:p>
+      <w:pPr>
+        <w:pStyle w:val="ListBullet"/>
+      </w:pPr>
+      <w:r>
+        <w:t>RAG: source reconciliation and query routes</w:t>
+      </w:r>
+    </w:p>
+    <w:p>
+      <w:pPr>
+        <w:pStyle w:val="ListBullet"/>
+      </w:pPr>
+      <w:r>
+        <w:t>Internal worker callbacks: `/internal/jobs/{job_id}/started`, `/retrying`, `/complete`</w:t>
+      </w:r>
+    </w:p>
+    <w:p>
+      <w:pPr>
+        <w:shd w:fill="F4F6F8"/>
+      </w:pPr>
+      <w:r>
+        <w:rPr>
+          <w:rFonts w:ascii="Consolas" w:hAnsi="Consolas"/>
+          <w:sz w:val="18"/>
+        </w:rPr>
+        <w:t>POST /v1/sessions</w:t>
+        <w:br/>
+        <w:t>POST /v1/sessions/{session_id}/messages</w:t>
+        <w:br/>
+        <w:t>GET  /v1/jobs/{job_id}</w:t>
+        <w:br/>
+        <w:t>GET  /v1/sessions/{session_id}/artifacts</w:t>
+      </w:r>
+    </w:p>
+    <w:p>
+      <w:pPr>
+        <w:pStyle w:val="Heading1"/>
+      </w:pPr>
+      <w:r>
+        <w:t>5. Persistent LLM State</w:t>
       </w:r>
     </w:p>
     <w:p>
       <w:r>
-        <w:t>See architecture.drawio for editable source.</w:t>
+        <w:t>The current implementation uses a shared mount for persistent model state and stores the active training snapshots in a SQLite database, not in a directory of standalone JSON files.</w:t>
+      </w:r>
+    </w:p>
+    <w:p>
+      <w:pPr>
+        <w:pStyle w:val="ListBullet"/>
+      </w:pPr>
+      <w:r>
+        <w:t>Default host path: `./data/llm/state`</w:t>
+      </w:r>
+    </w:p>
+    <w:p>
+      <w:pPr>
+        <w:pStyle w:val="ListBullet"/>
+      </w:pPr>
+      <w:r>
+        <w:t>Default container path: `/data/llm/state`</w:t>
+      </w:r>
+    </w:p>
+    <w:p>
+      <w:pPr>
+        <w:pStyle w:val="ListBullet"/>
+      </w:pPr>
+      <w:r>
+        <w:t>SQLite database file: `llm-state.sqlite3`</w:t>
+      </w:r>
+    </w:p>
+    <w:p>
+      <w:pPr>
+        <w:pStyle w:val="ListBullet"/>
+      </w:pPr>
+      <w:r>
+        <w:t>Logical payloads include manifest, inference profile, checkpoint, optimizer state, weights metadata, LoRA metadata, and embedding index data</w:t>
+      </w:r>
+    </w:p>
+    <w:p>
+      <w:pPr>
+        <w:pStyle w:val="ListBullet"/>
+      </w:pPr>
+      <w:r>
+        <w:t>`tools/train_llm_state.py` creates new runs and updates the latest pointer used by the worker</w:t>
+      </w:r>
+    </w:p>
+    <w:p>
+      <w:pPr>
+        <w:pStyle w:val="Heading1"/>
+      </w:pPr>
+      <w:r>
+        <w:t>6. Operational Behavior and Failure Handling</w:t>
+      </w:r>
+    </w:p>
+    <w:p>
+      <w:pPr>
+        <w:pStyle w:val="ListBullet"/>
+      </w:pPr>
+      <w:r>
+        <w:t>Jobs can move through `queued`, `started`, `retrying`, `finished`, and `failed`.</w:t>
+      </w:r>
+    </w:p>
+    <w:p>
+      <w:pPr>
+        <w:pStyle w:val="ListBullet"/>
+      </w:pPr>
+      <w:r>
+        <w:t>The worker performs semantic validation for known bad macro patterns before execution.</w:t>
+      </w:r>
+    </w:p>
+    <w:p>
+      <w:pPr>
+        <w:pStyle w:val="ListBullet"/>
+      </w:pPr>
+      <w:r>
+        <w:t>Runner-captured macro exceptions are treated as failures even if export artifacts exist.</w:t>
+      </w:r>
+    </w:p>
+    <w:p>
+      <w:pPr>
+        <w:pStyle w:val="ListBullet"/>
+      </w:pPr>
+      <w:r>
+        <w:t>Completion from `retrying` is supported so retried jobs can terminate cleanly.</w:t>
+      </w:r>
+    </w:p>
+    <w:p>
+      <w:r>
+        <w:t>Important FreeCAD-specific validation now rejects examples such as `App.Rotation(App.Vector(...))` without an angle and incorrect assignment of the `App.Placement` type itself.</w:t>
+      </w:r>
+    </w:p>
+    <w:p>
+      <w:pPr>
+        <w:pStyle w:val="Heading1"/>
+      </w:pPr>
+      <w:r>
+        <w:t>7. Documentation Map</w:t>
+      </w:r>
+    </w:p>
+    <w:p>
+      <w:pPr>
+        <w:pStyle w:val="ListBullet"/>
+      </w:pPr>
+      <w:r>
+        <w:t>Root `README.md`: project overview, quick start, browser tools, CLI, persistent state, configuration</w:t>
+      </w:r>
+    </w:p>
+    <w:p>
+      <w:pPr>
+        <w:pStyle w:val="ListBullet"/>
+      </w:pPr>
+      <w:r>
+        <w:t>`docs/web-ui-readme.md`: browser workflow</w:t>
+      </w:r>
+    </w:p>
+    <w:p>
+      <w:pPr>
+        <w:pStyle w:val="ListBullet"/>
+      </w:pPr>
+      <w:r>
+        <w:t>`docs/minio-readme.md`: object storage and console details</w:t>
+      </w:r>
+    </w:p>
+    <w:p>
+      <w:pPr>
+        <w:pStyle w:val="ListBullet"/>
+      </w:pPr>
+      <w:r>
+        <w:t>`docs/rest-api-readme.md`: API route overview</w:t>
+      </w:r>
+    </w:p>
+    <w:p>
+      <w:pPr>
+        <w:pStyle w:val="ListBullet"/>
+      </w:pPr>
+      <w:r>
+        <w:t>`docs/cad-agent-cli-readme.md`: CLI usage</w:t>
+      </w:r>
+    </w:p>
+    <w:p>
+      <w:pPr>
+        <w:pStyle w:val="ListBullet"/>
+      </w:pPr>
+      <w:r>
+        <w:t>`docs/operational-runbook.md`: operator troubleshooting and recovery steps</w:t>
+      </w:r>
+    </w:p>
+    <w:p>
+      <w:pPr>
+        <w:pStyle w:val="ListBullet"/>
+      </w:pPr>
+      <w:r>
+        <w:t>`docs/train_llm_state/README.md`: full guide to persistent training-state generation</w:t>
+      </w:r>
+    </w:p>
+    <w:p>
+      <w:pPr>
+        <w:jc w:val="center"/>
+      </w:pPr>
+      <w:r>
+        <w:rPr>
+          <w:i/>
+          <w:sz w:val="20"/>
+        </w:rPr>
+        <w:t>See docs/architecture.drawio for the editable architecture diagram source.</w:t>
       </w:r>
     </w:p>
     <w:sectPr>
       <w:pgSz w:w="12240" w:h="15840"/>
-      <w:pgMar w:top="1440" w:right="1800" w:bottom="1440" w:left="1800" w:header="720" w:footer="720" w:gutter="0"/>
+      <w:pgMar w:top="1008" w:right="1152" w:bottom="1008" w:left="1152" w:header="720" w:footer="720" w:gutter="0"/>
       <w:cols w:space="720"/>
       <w:docGrid w:linePitch="360"/>
     </w:sectPr>
@@ -541,6 +948,10 @@
     <w:name w:val="Normal"/>
     <w:qFormat/>
     <w:rsid w:val="00FC693F"/>
+    <w:rPr>
+      <w:rFonts w:ascii="Aptos" w:hAnsi="Aptos"/>
+      <w:sz w:val="21"/>
+    </w:rPr>
   </w:style>
   <w:style w:type="paragraph" w:styleId="Header">
     <w:name w:val="header"/>
@@ -601,11 +1012,11 @@
       <w:outlineLvl w:val="0"/>
     </w:pPr>
     <w:rPr>
-      <w:rFonts w:asciiTheme="majorHAnsi" w:eastAsiaTheme="majorEastAsia" w:hAnsiTheme="majorHAnsi" w:cstheme="majorBidi"/>
+      <w:rFonts w:asciiTheme="majorHAnsi" w:eastAsiaTheme="majorEastAsia" w:hAnsiTheme="majorHAnsi" w:cstheme="majorBidi" w:ascii="Aptos Display" w:hAnsi="Aptos Display"/>
       <w:b/>
       <w:bCs/>
       <w:color w:val="365F91" w:themeColor="accent1" w:themeShade="BF"/>
-      <w:sz w:val="28"/>
+      <w:sz w:val="30"/>
       <w:szCs w:val="28"/>
     </w:rPr>
   </w:style>
@@ -625,11 +1036,11 @@
       <w:outlineLvl w:val="1"/>
     </w:pPr>
     <w:rPr>
-      <w:rFonts w:asciiTheme="majorHAnsi" w:eastAsiaTheme="majorEastAsia" w:hAnsiTheme="majorHAnsi" w:cstheme="majorBidi"/>
+      <w:rFonts w:asciiTheme="majorHAnsi" w:eastAsiaTheme="majorEastAsia" w:hAnsiTheme="majorHAnsi" w:cstheme="majorBidi" w:ascii="Aptos Display" w:hAnsi="Aptos Display"/>
       <w:b/>
       <w:bCs/>
       <w:color w:val="4F81BD" w:themeColor="accent1"/>
-      <w:sz w:val="26"/>
+      <w:sz w:val="25"/>
       <w:szCs w:val="26"/>
     </w:rPr>
   </w:style>
@@ -890,11 +1301,11 @@
       <w:contextualSpacing/>
     </w:pPr>
     <w:rPr>
-      <w:rFonts w:asciiTheme="majorHAnsi" w:eastAsiaTheme="majorEastAsia" w:hAnsiTheme="majorHAnsi" w:cstheme="majorBidi"/>
+      <w:rFonts w:asciiTheme="majorHAnsi" w:eastAsiaTheme="majorEastAsia" w:hAnsiTheme="majorHAnsi" w:cstheme="majorBidi" w:ascii="Aptos Display" w:hAnsi="Aptos Display"/>
       <w:color w:val="17365D" w:themeColor="text2" w:themeShade="BF"/>
       <w:spacing w:val="5"/>
       <w:kern w:val="28"/>
-      <w:sz w:val="52"/>
+      <w:sz w:val="44"/>
       <w:szCs w:val="52"/>
     </w:rPr>
   </w:style>

</xml_diff>